<commit_message>
asembly to RVmachine converter  link added
</commit_message>
<xml_diff>
--- a/RV32 asembler .docx
+++ b/RV32 asembler .docx
@@ -152,15 +152,7 @@
         </w:drawing>
       </w:r>
       <w:r>
-        <w:t xml:space="preserve">Instruction assembler </w:t>
-      </w:r>
-      <w:proofErr w:type="spellStart"/>
-      <w:r>
-        <w:t>pseudoinstruction</w:t>
-      </w:r>
-      <w:proofErr w:type="spellEnd"/>
-      <w:r>
-        <w:t xml:space="preserve"> </w:t>
+        <w:t xml:space="preserve">Instruction assembler pseudoinstruction </w:t>
       </w:r>
     </w:p>
     <w:p>
@@ -867,13 +859,8 @@
     <w:p/>
     <w:p/>
     <w:p>
-      <w:proofErr w:type="spellStart"/>
       <w:r>
-        <w:t>Refecrences</w:t>
-      </w:r>
-      <w:proofErr w:type="spellEnd"/>
-      <w:r>
-        <w:t xml:space="preserve"> </w:t>
+        <w:t xml:space="preserve">Refecrences </w:t>
       </w:r>
     </w:p>
     <w:p>
@@ -952,7 +939,21 @@
       </w:hyperlink>
     </w:p>
     <w:p/>
-    <w:p/>
+    <w:p>
+      <w:r>
+        <w:t>online asmbly to machine lang compiler</w:t>
+      </w:r>
+    </w:p>
+    <w:p>
+      <w:hyperlink r:id="rId31" w:history="1">
+        <w:r>
+          <w:rPr>
+            <w:rStyle w:val="Hyperlink"/>
+          </w:rPr>
+          <w:t>https://riscvasm.lucasteske.dev/#</w:t>
+        </w:r>
+      </w:hyperlink>
+    </w:p>
     <w:p/>
     <w:p/>
     <w:sectPr>
@@ -1904,6 +1905,18 @@
       <w:shd w:val="clear" w:color="auto" w:fill="E1DFDD"/>
     </w:rPr>
   </w:style>
+  <w:style w:type="character" w:styleId="FollowedHyperlink">
+    <w:name w:val="FollowedHyperlink"/>
+    <w:basedOn w:val="DefaultParagraphFont"/>
+    <w:uiPriority w:val="99"/>
+    <w:semiHidden/>
+    <w:unhideWhenUsed/>
+    <w:rsid w:val="007F70D4"/>
+    <w:rPr>
+      <w:color w:val="96607D" w:themeColor="followedHyperlink"/>
+      <w:u w:val="single"/>
+    </w:rPr>
+  </w:style>
 </w:styles>
 </file>
 
@@ -2160,7 +2173,7 @@
     </inkml:brush>
   </inkml:definitions>
   <inkml:trace contextRef="#ctx0" brushRef="#br0">448 164 24575,'-1'5'0,"0"0"0,0-1 0,-1 1 0,1-1 0,-1 0 0,0 1 0,0-1 0,0 0 0,-1 0 0,1 0 0,-1 0 0,0-1 0,0 1 0,0-1 0,-1 0 0,-5 5 0,-9 6 0,-37 23 0,54-36 0,-36 20 0,-1-1 0,-1-3 0,-1-1 0,-72 19 0,108-34-105,0 1 0,-1-1 0,1 1 0,0 0 0,0 0 0,0 1 0,0-1 0,0 1 0,0 0 0,1 0 0,-1 0 0,-4 7 0,1-2-6721</inkml:trace>
-  <inkml:trace contextRef="#ctx0" brushRef="#br0" timeOffset="540.96">39 1 24575,'5'5'0,"5"10"0,2 9 0,8 9 0,5 14 0,6 5 0,8 8 0,8-1 0,4 1 0,-3-1 0,0-2 0,-7-6 0,-5-3 0,-6-8 0,-5-8 0,-5-7 0,-5-5 0,-6-6-8191</inkml:trace>
+  <inkml:trace contextRef="#ctx0" brushRef="#br0" timeOffset="540.95">39 1 24575,'5'5'0,"5"10"0,2 9 0,8 9 0,5 14 0,6 5 0,8 8 0,8-1 0,4 1 0,-3-1 0,0-2 0,-7-6 0,-5-3 0,-6-8 0,-5-8 0,-5-7 0,-5-5 0,-6-6-8191</inkml:trace>
 </inkml:ink>
 </file>
 

</xml_diff>